<commit_message>
feat(core): update .docx template and generation
</commit_message>
<xml_diff>
--- a/assets/templates/base.docx
+++ b/assets/templates/base.docx
@@ -9,8 +9,11 @@
         <w:ind/>
         <w:jc w:val="center"/>
         <w:rPr>
+          <w:b/>
+          <w:bCs/>
           <w:sz w:val="28"/>
           <w:szCs w:val="28"/>
+          <w:highlight w:val="none"/>
           <w:lang w:val="en-US"/>
         </w:rPr>
       </w:pPr>
@@ -38,51 +41,26 @@
           <w:lang w:val="en-US"/>
         </w:rPr>
       </w:r>
-      <w:r>
-        <w:rPr>
-          <w:sz w:val="28"/>
-          <w:szCs w:val="28"/>
-          <w:lang w:val="en-US"/>
-        </w:rPr>
-      </w:r>
     </w:p>
     <w:p>
       <w:pPr>
-        <w:pBdr/>
-        <w:spacing/>
-        <w:ind/>
-        <w:rPr/>
-      </w:pPr>
-      <w:r/>
-      <w:r/>
-    </w:p>
-    <w:p>
-      <w:pPr>
-        <w:pStyle w:val="1145"/>
+        <w:pStyle w:val="1_2737"/>
         <w:numPr>
           <w:ilvl w:val="0"/>
-          <w:numId w:val="1"/>
+          <w:numId w:val="3"/>
         </w:numPr>
         <w:pBdr/>
-        <w:tabs>
-          <w:tab w:val="left" w:leader="none" w:pos="1800"/>
-        </w:tabs>
-        <w:spacing/>
-        <w:ind/>
-        <w:rPr>
-          <w:lang w:val="en-US"/>
-        </w:rPr>
+        <w:spacing w:line="288" w:lineRule="auto"/>
+        <w:ind/>
+        <w:contextualSpacing w:val="true"/>
+        <w:jc w:val="both"/>
+        <w:rPr/>
       </w:pPr>
       <w:r>
         <w:rPr>
           <w:lang w:val="en-US"/>
         </w:rPr>
         <w:t xml:space="preserve">{{</w:t>
-      </w:r>
-      <w:r>
-        <w:rPr>
-          <w:lang w:val="en-US"/>
-        </w:rPr>
       </w:r>
       <w:r>
         <w:rPr>
@@ -95,59 +73,56 @@
           <w:lang w:val="en-US"/>
         </w:rPr>
         <w:t xml:space="preserve">}}</w:t>
-        <w:br/>
       </w:r>
+      <w:r/>
+    </w:p>
+    <w:p>
+      <w:pPr>
+        <w:pStyle w:val="1_2737"/>
+        <w:numPr>
+          <w:ilvl w:val="0"/>
+          <w:numId w:val="3"/>
+        </w:numPr>
+        <w:pBdr/>
+        <w:spacing w:line="288" w:lineRule="auto"/>
+        <w:ind/>
+        <w:contextualSpacing w:val="true"/>
+        <w:jc w:val="both"/>
+        <w:rPr/>
+      </w:pPr>
       <w:r>
         <w:rPr>
-          <w:lang w:val="en-US"/>
-        </w:rPr>
-      </w:r>
-      <w:r>
-        <w:rPr>
-          <w:lang w:val="en-US"/>
-        </w:rPr>
-      </w:r>
-    </w:p>
-    <w:p>
-      <w:pPr>
-        <w:pStyle w:val="1145"/>
-        <w:numPr>
-          <w:ilvl w:val="0"/>
-          <w:numId w:val="1"/>
-        </w:numPr>
-        <w:pBdr/>
-        <w:tabs>
-          <w:tab w:val="left" w:leader="none" w:pos="7110"/>
-        </w:tabs>
-        <w:spacing/>
-        <w:ind/>
-        <w:rPr/>
-      </w:pPr>
-      <w:r>
-        <w:rPr>
+          <w:highlight w:val="none"/>
           <w:lang w:val="en-US"/>
         </w:rPr>
         <w:t xml:space="preserve">{{</w:t>
       </w:r>
       <w:r>
         <w:rPr>
-          <w:lang w:val="en-US"/>
-        </w:rPr>
-      </w:r>
-      <w:r>
-        <w:rPr>
+          <w:highlight w:val="none"/>
           <w:lang w:val="en-US"/>
         </w:rPr>
         <w:t xml:space="preserve">question_practical</w:t>
       </w:r>
       <w:r>
         <w:rPr>
+          <w:highlight w:val="none"/>
           <w:lang w:val="en-US"/>
         </w:rPr>
         <w:t xml:space="preserve">}}</w:t>
-        <w:br/>
       </w:r>
-      <w:r/>
+      <w:r>
+        <w:rPr>
+          <w:highlight w:val="none"/>
+          <w:lang w:val="en-US"/>
+        </w:rPr>
+      </w:r>
+      <w:r>
+        <w:rPr>
+          <w:highlight w:val="none"/>
+          <w:lang w:val="en-US"/>
+        </w:rPr>
+      </w:r>
     </w:p>
     <w:sectPr>
       <w:headerReference w:type="default" r:id="rId9"/>
@@ -565,6 +540,7 @@
         </w:tcPr>
         <w:p>
           <w:pPr>
+            <w:pStyle w:val="1130"/>
             <w:pBdr/>
             <w:spacing/>
             <w:ind/>
@@ -626,6 +602,7 @@
         </w:tcPr>
         <w:p>
           <w:pPr>
+            <w:pStyle w:val="1130"/>
             <w:pBdr/>
             <w:spacing/>
             <w:ind/>
@@ -649,7 +626,6 @@
               <w:szCs w:val="22"/>
             </w:rPr>
             <w:t xml:space="preserve">Председатель ЦМК</w:t>
-            <w:br/>
           </w:r>
           <w:r>
             <w:rPr>
@@ -674,10 +650,11 @@
         </w:p>
         <w:p>
           <w:pPr>
+            <w:pStyle w:val="1130"/>
             <w:pBdr/>
             <w:spacing/>
-            <w:ind w:right="-127"/>
-            <w:jc w:val="left"/>
+            <w:ind/>
+            <w:jc w:val="center"/>
             <w:rPr>
               <w:rFonts w:eastAsia="Calibri"/>
               <w:b/>
@@ -705,10 +682,7 @@
               <w:iCs/>
               <w:sz w:val="22"/>
               <w:szCs w:val="22"/>
-              <w:u w:val="single"/>
-              <w:lang w:val="en-US"/>
             </w:rPr>
-            <w:t xml:space="preserve"> </w:t>
           </w:r>
           <w:r>
             <w:rPr>
@@ -718,11 +692,24 @@
               <w:iCs/>
               <w:sz w:val="22"/>
               <w:szCs w:val="22"/>
-              <w:u w:val="single"/>
-              <w:lang w:val="en-US"/>
             </w:rPr>
-            <w:t xml:space="preserve">‎ </w:t>
           </w:r>
+        </w:p>
+        <w:p>
+          <w:pPr>
+            <w:pStyle w:val="1130"/>
+            <w:pBdr/>
+            <w:spacing/>
+            <w:ind w:right="-127"/>
+            <w:rPr>
+              <w:rFonts w:eastAsia="Calibri"/>
+              <w:b/>
+              <w:bCs/>
+              <w:iCs/>
+              <w:sz w:val="22"/>
+              <w:szCs w:val="22"/>
+            </w:rPr>
+          </w:pPr>
           <w:r>
             <w:rPr>
               <w:rFonts w:eastAsia="Calibri"/>
@@ -731,296 +718,9 @@
               <w:iCs/>
               <w:sz w:val="22"/>
               <w:szCs w:val="22"/>
-              <w:u w:val="single"/>
               <w:lang w:val="en-US"/>
             </w:rPr>
-            <w:t xml:space="preserve">‎ </w:t>
-          </w:r>
-          <w:r>
-            <w:rPr>
-              <w:rFonts w:eastAsia="Calibri"/>
-              <w:b/>
-              <w:bCs/>
-              <w:iCs/>
-              <w:sz w:val="22"/>
-              <w:szCs w:val="22"/>
-              <w:u w:val="single"/>
-              <w:lang w:val="en-US"/>
-            </w:rPr>
-            <w:t xml:space="preserve">‎ </w:t>
-          </w:r>
-          <w:r>
-            <w:rPr>
-              <w:rFonts w:eastAsia="Calibri"/>
-              <w:b/>
-              <w:bCs/>
-              <w:iCs/>
-              <w:sz w:val="22"/>
-              <w:szCs w:val="22"/>
-              <w:u w:val="single"/>
-              <w:lang w:val="en-US"/>
-            </w:rPr>
-            <w:t xml:space="preserve">‎ </w:t>
-          </w:r>
-          <w:r>
-            <w:rPr>
-              <w:rFonts w:eastAsia="Calibri"/>
-              <w:b/>
-              <w:bCs/>
-              <w:iCs/>
-              <w:sz w:val="22"/>
-              <w:szCs w:val="22"/>
-              <w:u w:val="single"/>
-              <w:lang w:val="en-US"/>
-            </w:rPr>
-            <w:t xml:space="preserve">‎ </w:t>
-          </w:r>
-          <w:r>
-            <w:rPr>
-              <w:rFonts w:eastAsia="Calibri"/>
-              <w:b/>
-              <w:bCs/>
-              <w:iCs/>
-              <w:sz w:val="22"/>
-              <w:szCs w:val="22"/>
-              <w:u w:val="single"/>
-              <w:lang w:val="en-US"/>
-            </w:rPr>
-            <w:t xml:space="preserve">‎ </w:t>
-          </w:r>
-          <w:r>
-            <w:rPr>
-              <w:rFonts w:eastAsia="Calibri"/>
-              <w:b/>
-              <w:bCs/>
-              <w:iCs/>
-              <w:sz w:val="22"/>
-              <w:szCs w:val="22"/>
-              <w:u w:val="single"/>
-              <w:lang w:val="en-US"/>
-            </w:rPr>
-            <w:t xml:space="preserve">‎ </w:t>
-          </w:r>
-          <w:r>
-            <w:rPr>
-              <w:rFonts w:eastAsia="Calibri"/>
-              <w:b/>
-              <w:bCs/>
-              <w:iCs/>
-              <w:sz w:val="22"/>
-              <w:szCs w:val="22"/>
-              <w:u w:val="single"/>
-              <w:lang w:val="en-US"/>
-            </w:rPr>
-            <w:t xml:space="preserve">‎ </w:t>
-          </w:r>
-          <w:r>
-            <w:rPr>
-              <w:rFonts w:eastAsia="Calibri"/>
-              <w:b/>
-              <w:bCs/>
-              <w:iCs/>
-              <w:sz w:val="22"/>
-              <w:szCs w:val="22"/>
-              <w:u w:val="single"/>
-              <w:lang w:val="en-US"/>
-            </w:rPr>
-            <w:t xml:space="preserve">‎ </w:t>
-          </w:r>
-          <w:r>
-            <w:rPr>
-              <w:rFonts w:eastAsia="Calibri"/>
-              <w:b/>
-              <w:bCs/>
-              <w:iCs/>
-              <w:sz w:val="22"/>
-              <w:szCs w:val="22"/>
-              <w:u w:val="single"/>
-              <w:lang w:val="en-US"/>
-            </w:rPr>
-            <w:t xml:space="preserve">‎ </w:t>
-          </w:r>
-          <w:r>
-            <w:rPr>
-              <w:rFonts w:eastAsia="Calibri"/>
-              <w:b/>
-              <w:bCs/>
-              <w:iCs/>
-              <w:sz w:val="22"/>
-              <w:szCs w:val="22"/>
-              <w:u w:val="single"/>
-              <w:lang w:val="en-US"/>
-            </w:rPr>
-            <w:t xml:space="preserve">‎ </w:t>
-          </w:r>
-          <w:r>
-            <w:rPr>
-              <w:rFonts w:eastAsia="Calibri"/>
-              <w:b/>
-              <w:bCs/>
-              <w:iCs/>
-              <w:sz w:val="22"/>
-              <w:szCs w:val="22"/>
-              <w:u w:val="single"/>
-              <w:lang w:val="en-US"/>
-            </w:rPr>
-            <w:t xml:space="preserve">‎ </w:t>
-          </w:r>
-          <w:r>
-            <w:rPr>
-              <w:rFonts w:eastAsia="Calibri"/>
-              <w:b/>
-              <w:bCs/>
-              <w:iCs/>
-              <w:sz w:val="22"/>
-              <w:szCs w:val="22"/>
-              <w:u w:val="single"/>
-              <w:lang w:val="en-US"/>
-            </w:rPr>
-            <w:t xml:space="preserve">‎ </w:t>
-          </w:r>
-          <w:r>
-            <w:rPr>
-              <w:rFonts w:eastAsia="Calibri"/>
-              <w:b/>
-              <w:bCs/>
-              <w:iCs/>
-              <w:sz w:val="22"/>
-              <w:szCs w:val="22"/>
-              <w:u w:val="single"/>
-              <w:lang w:val="en-US"/>
-            </w:rPr>
-            <w:t xml:space="preserve">‎ </w:t>
-          </w:r>
-          <w:r>
-            <w:rPr>
-              <w:rFonts w:eastAsia="Calibri"/>
-              <w:b/>
-              <w:bCs/>
-              <w:iCs/>
-              <w:sz w:val="22"/>
-              <w:szCs w:val="22"/>
-              <w:u w:val="single"/>
-              <w:lang w:val="en-US"/>
-            </w:rPr>
-            <w:t xml:space="preserve">‎ </w:t>
-          </w:r>
-          <w:r>
-            <w:rPr>
-              <w:rFonts w:eastAsia="Calibri"/>
-              <w:b/>
-              <w:bCs/>
-              <w:iCs/>
-              <w:sz w:val="22"/>
-              <w:szCs w:val="22"/>
-              <w:u w:val="single"/>
-              <w:lang w:val="en-US"/>
-            </w:rPr>
-            <w:t xml:space="preserve">‎</w:t>
-          </w:r>
-          <w:r>
-            <w:rPr>
-              <w:rFonts w:eastAsia="Calibri"/>
-              <w:b/>
-              <w:bCs/>
-              <w:iCs/>
-              <w:sz w:val="22"/>
-              <w:szCs w:val="22"/>
-              <w:u w:val="single"/>
-              <w:lang w:val="en-US"/>
-            </w:rPr>
-            <w:t xml:space="preserve">‎ </w:t>
-          </w:r>
-          <w:r>
-            <w:rPr>
-              <w:rFonts w:eastAsia="Calibri"/>
-              <w:b/>
-              <w:bCs/>
-              <w:iCs/>
-              <w:sz w:val="22"/>
-              <w:szCs w:val="22"/>
-              <w:u w:val="single"/>
-              <w:lang w:val="en-US"/>
-            </w:rPr>
-            <w:t xml:space="preserve">‎ </w:t>
-          </w:r>
-          <w:r>
-            <w:rPr>
-              <w:rFonts w:eastAsia="Calibri"/>
-              <w:b/>
-              <w:bCs/>
-              <w:iCs/>
-              <w:sz w:val="22"/>
-              <w:szCs w:val="22"/>
-              <w:u w:val="single"/>
-              <w:lang w:val="en-US"/>
-            </w:rPr>
-            <w:t xml:space="preserve">‎ </w:t>
-          </w:r>
-          <w:r>
-            <w:rPr>
-              <w:rFonts w:eastAsia="Calibri"/>
-              <w:b/>
-              <w:bCs/>
-              <w:iCs/>
-              <w:sz w:val="22"/>
-              <w:szCs w:val="22"/>
-              <w:u w:val="single"/>
-              <w:lang w:val="en-US"/>
-            </w:rPr>
-            <w:t xml:space="preserve">‎ </w:t>
-          </w:r>
-          <w:r>
-            <w:rPr>
-              <w:rFonts w:eastAsia="Calibri"/>
-              <w:b/>
-              <w:bCs/>
-              <w:iCs/>
-              <w:sz w:val="22"/>
-              <w:szCs w:val="22"/>
-              <w:u w:val="single"/>
-              <w:lang w:val="en-US"/>
-            </w:rPr>
-            <w:t xml:space="preserve">‎</w:t>
-          </w:r>
-          <w:r>
-            <w:rPr>
-              <w:rFonts w:eastAsia="Calibri"/>
-              <w:b/>
-              <w:bCs/>
-              <w:iCs/>
-              <w:sz w:val="22"/>
-              <w:szCs w:val="22"/>
-              <w:u w:val="none"/>
-              <w:lang w:val="en-US"/>
-            </w:rPr>
-            <w:t xml:space="preserve">{{</w:t>
-          </w:r>
-          <w:r>
-            <w:rPr>
-              <w:rFonts w:eastAsia="Calibri"/>
-              <w:b/>
-              <w:bCs/>
-              <w:iCs/>
-              <w:sz w:val="22"/>
-              <w:szCs w:val="22"/>
-              <w:u w:val="none"/>
-              <w:lang w:val="en-US"/>
-            </w:rPr>
-            <w:t xml:space="preserve">cmk</w:t>
-          </w:r>
-          <w:r>
-            <w:rPr>
-              <w:rFonts w:eastAsia="Calibri"/>
-              <w:b/>
-              <w:bCs/>
-              <w:iCs/>
-              <w:sz w:val="22"/>
-              <w:szCs w:val="22"/>
-              <w:u w:val="none"/>
-              <w:lang w:val="en-US"/>
-            </w:rPr>
-            <w:t xml:space="preserve">}}</w:t>
+            <w:t xml:space="preserve">{{cmk}}</w:t>
           </w:r>
           <w:r>
             <w:rPr>
@@ -1045,17 +745,16 @@
         </w:p>
         <w:p>
           <w:pPr>
+            <w:pStyle w:val="1130"/>
             <w:pBdr/>
             <w:spacing/>
-            <w:ind w:right="-127"/>
+            <w:ind/>
             <w:jc w:val="center"/>
             <w:rPr>
               <w:rFonts w:eastAsia="Calibri"/>
               <w:b/>
-              <w:bCs/>
               <w:sz w:val="22"/>
               <w:szCs w:val="22"/>
-              <w:highlight w:val="yellow"/>
             </w:rPr>
           </w:pPr>
           <w:r>
@@ -1077,7 +776,6 @@
               <w:iCs/>
               <w:sz w:val="22"/>
               <w:szCs w:val="22"/>
-              <w:u w:val="none"/>
               <w:lang w:val="en-US"/>
             </w:rPr>
             <w:t xml:space="preserve">{{day}}</w:t>
@@ -1091,7 +789,7 @@
               <w:sz w:val="22"/>
               <w:szCs w:val="22"/>
             </w:rPr>
-            <w:t xml:space="preserve">»</w:t>
+            <w:t xml:space="preserve">» </w:t>
           </w:r>
           <w:r>
             <w:rPr>
@@ -1103,77 +801,7 @@
               <w:szCs w:val="22"/>
               <w:lang w:val="en-US"/>
             </w:rPr>
-            <w:t xml:space="preserve"> </w:t>
-          </w:r>
-          <w:r>
-            <w:rPr>
-              <w:rFonts w:eastAsia="Calibri"/>
-              <w:b/>
-              <w:bCs/>
-              <w:sz w:val="22"/>
-              <w:szCs w:val="22"/>
-              <w:u w:val="none"/>
-              <w:lang w:val="en-US"/>
-            </w:rPr>
-            <w:t xml:space="preserve">{</w:t>
-          </w:r>
-          <w:r>
-            <w:rPr>
-              <w:rFonts w:eastAsia="Calibri"/>
-              <w:b/>
-              <w:bCs/>
-              <w:sz w:val="22"/>
-              <w:szCs w:val="22"/>
-              <w:u w:val="none"/>
-              <w:lang w:val="en-US"/>
-            </w:rPr>
-            <w:t xml:space="preserve">{</w:t>
-          </w:r>
-          <w:r>
-            <w:rPr>
-              <w:rFonts w:eastAsia="Calibri"/>
-              <w:b/>
-              <w:bCs/>
-              <w:sz w:val="22"/>
-              <w:szCs w:val="22"/>
-              <w:u w:val="none"/>
-              <w:lang w:val="en-US"/>
-            </w:rPr>
-            <w:t xml:space="preserve">month</w:t>
-          </w:r>
-          <w:r>
-            <w:rPr>
-              <w:rFonts w:eastAsia="Calibri"/>
-              <w:b/>
-              <w:bCs/>
-              <w:sz w:val="22"/>
-              <w:szCs w:val="22"/>
-              <w:u w:val="none"/>
-              <w:lang w:val="en-US"/>
-            </w:rPr>
-            <w:t xml:space="preserve">}</w:t>
-          </w:r>
-          <w:r>
-            <w:rPr>
-              <w:rFonts w:eastAsia="Calibri"/>
-              <w:b/>
-              <w:bCs/>
-              <w:sz w:val="22"/>
-              <w:szCs w:val="22"/>
-              <w:u w:val="none"/>
-              <w:lang w:val="en-US"/>
-            </w:rPr>
-            <w:t xml:space="preserve">}</w:t>
-          </w:r>
-          <w:r>
-            <w:rPr>
-              <w:rFonts w:eastAsia="Calibri"/>
-              <w:b/>
-              <w:sz w:val="22"/>
-              <w:szCs w:val="22"/>
-              <w:lang w:val="en-US"/>
-            </w:rPr>
-            <w:t xml:space="preserve">{{year}}</w:t>
+            <w:t xml:space="preserve">{{month}} {{year}}</w:t>
           </w:r>
           <w:r>
             <w:rPr>
@@ -1190,10 +818,16 @@
             <w:rPr>
               <w:rFonts w:eastAsia="Calibri"/>
               <w:b/>
-              <w:bCs/>
               <w:sz w:val="22"/>
               <w:szCs w:val="22"/>
-              <w:highlight w:val="yellow"/>
+            </w:rPr>
+          </w:r>
+          <w:r>
+            <w:rPr>
+              <w:rFonts w:eastAsia="Calibri"/>
+              <w:b/>
+              <w:sz w:val="22"/>
+              <w:szCs w:val="22"/>
             </w:rPr>
           </w:r>
           <w:r>
@@ -1201,9 +835,75 @@
               <w:rFonts w:eastAsia="Calibri"/>
               <w:b/>
               <w:bCs/>
+              <w:iCs/>
               <w:sz w:val="22"/>
               <w:szCs w:val="22"/>
-              <w:highlight w:val="yellow"/>
+            </w:rPr>
+          </w:r>
+          <w:r>
+            <w:rPr>
+              <w:rFonts w:eastAsia="Calibri"/>
+              <w:b/>
+              <w:bCs/>
+              <w:iCs/>
+              <w:sz w:val="22"/>
+              <w:szCs w:val="22"/>
+            </w:rPr>
+          </w:r>
+          <w:r>
+            <w:rPr>
+              <w:rFonts w:eastAsia="Calibri"/>
+              <w:b/>
+              <w:bCs/>
+              <w:iCs/>
+              <w:sz w:val="22"/>
+              <w:szCs w:val="22"/>
+            </w:rPr>
+          </w:r>
+          <w:r>
+            <w:rPr>
+              <w:rFonts w:eastAsia="Calibri"/>
+              <w:b/>
+              <w:sz w:val="22"/>
+              <w:szCs w:val="22"/>
+            </w:rPr>
+          </w:r>
+          <w:r>
+            <w:rPr>
+              <w:rFonts w:eastAsia="Calibri"/>
+              <w:b/>
+              <w:bCs/>
+              <w:iCs/>
+              <w:sz w:val="22"/>
+              <w:szCs w:val="22"/>
+            </w:rPr>
+          </w:r>
+          <w:r>
+            <w:rPr>
+              <w:rFonts w:eastAsia="Calibri"/>
+              <w:b/>
+              <w:bCs/>
+              <w:iCs/>
+              <w:sz w:val="22"/>
+              <w:szCs w:val="22"/>
+            </w:rPr>
+          </w:r>
+          <w:r>
+            <w:rPr>
+              <w:rFonts w:eastAsia="Calibri"/>
+              <w:b/>
+              <w:bCs/>
+              <w:iCs/>
+              <w:sz w:val="22"/>
+              <w:szCs w:val="22"/>
+            </w:rPr>
+          </w:r>
+          <w:r>
+            <w:rPr>
+              <w:rFonts w:eastAsia="Calibri"/>
+              <w:b/>
+              <w:sz w:val="22"/>
+              <w:szCs w:val="22"/>
             </w:rPr>
           </w:r>
         </w:p>
@@ -1217,6 +917,7 @@
         </w:tcPr>
         <w:p>
           <w:pPr>
+            <w:pStyle w:val="1130"/>
             <w:pBdr/>
             <w:spacing/>
             <w:ind/>
@@ -1249,9 +950,8 @@
               <w:iCs/>
               <w:sz w:val="22"/>
               <w:szCs w:val="22"/>
-              <w:lang w:val="en-US"/>
             </w:rPr>
-            <w:t xml:space="preserve">{</w:t>
+            <w:t xml:space="preserve"> </w:t>
           </w:r>
           <w:r>
             <w:rPr>
@@ -1263,7 +963,31 @@
               <w:szCs w:val="22"/>
               <w:lang w:val="en-US"/>
             </w:rPr>
-            <w:t xml:space="preserve">{qualify}}</w:t>
+            <w:t xml:space="preserve">{{</w:t>
+          </w:r>
+          <w:r>
+            <w:rPr>
+              <w:rFonts w:eastAsia="Calibri"/>
+              <w:b/>
+              <w:bCs/>
+              <w:iCs/>
+              <w:sz w:val="22"/>
+              <w:szCs w:val="22"/>
+              <w:lang w:val="en-US"/>
+            </w:rPr>
+            <w:t xml:space="preserve">qualify</w:t>
+          </w:r>
+          <w:r>
+            <w:rPr>
+              <w:rFonts w:eastAsia="Calibri"/>
+              <w:b/>
+              <w:bCs/>
+              <w:iCs/>
+              <w:sz w:val="22"/>
+              <w:szCs w:val="22"/>
+              <w:lang w:val="en-US"/>
+            </w:rPr>
+            <w:t xml:space="preserve">}}</w:t>
           </w:r>
           <w:r>
             <w:rPr>
@@ -1359,6 +1083,7 @@
         </w:tcPr>
         <w:p>
           <w:pPr>
+            <w:pStyle w:val="1130"/>
             <w:pBdr/>
             <w:spacing/>
             <w:ind/>
@@ -1370,17 +1095,13 @@
               <w:iCs/>
               <w:sz w:val="22"/>
               <w:szCs w:val="22"/>
-              <w:lang w:val="en-US"/>
             </w:rPr>
           </w:pPr>
           <w:r>
             <w:rPr>
-              <w:rFonts w:eastAsia="Calibri"/>
               <w:b/>
               <w:bCs/>
               <w:iCs/>
-              <w:sz w:val="22"/>
-              <w:szCs w:val="22"/>
               <w:lang w:val="en-US"/>
             </w:rPr>
             <w:t xml:space="preserve">{{subject}}</w:t>
@@ -1393,18 +1114,6 @@
               <w:iCs/>
               <w:sz w:val="22"/>
               <w:szCs w:val="22"/>
-              <w:lang w:val="en-US"/>
-            </w:rPr>
-          </w:r>
-          <w:r>
-            <w:rPr>
-              <w:rFonts w:eastAsia="Calibri"/>
-              <w:b/>
-              <w:bCs/>
-              <w:iCs/>
-              <w:sz w:val="22"/>
-              <w:szCs w:val="22"/>
-              <w:lang w:val="en-US"/>
             </w:rPr>
           </w:r>
         </w:p>
@@ -1481,6 +1190,7 @@
         </w:tcPr>
         <w:p>
           <w:pPr>
+            <w:pStyle w:val="1130"/>
             <w:pBdr/>
             <w:spacing/>
             <w:ind/>
@@ -1504,8 +1214,44 @@
               <w:szCs w:val="22"/>
             </w:rPr>
             <w:t xml:space="preserve">Специальность</w:t>
-            <w:br/>
           </w:r>
+          <w:r>
+            <w:rPr>
+              <w:rFonts w:eastAsia="Calibri"/>
+              <w:b/>
+              <w:bCs/>
+              <w:iCs/>
+              <w:sz w:val="22"/>
+              <w:szCs w:val="22"/>
+            </w:rPr>
+          </w:r>
+          <w:r>
+            <w:rPr>
+              <w:rFonts w:eastAsia="Calibri"/>
+              <w:b/>
+              <w:bCs/>
+              <w:iCs/>
+              <w:sz w:val="22"/>
+              <w:szCs w:val="22"/>
+            </w:rPr>
+          </w:r>
+        </w:p>
+        <w:p>
+          <w:pPr>
+            <w:pStyle w:val="1130"/>
+            <w:pBdr/>
+            <w:spacing/>
+            <w:ind/>
+            <w:jc w:val="center"/>
+            <w:rPr>
+              <w:rFonts w:eastAsia="Calibri"/>
+              <w:b/>
+              <w:bCs/>
+              <w:iCs/>
+              <w:sz w:val="22"/>
+              <w:szCs w:val="22"/>
+            </w:rPr>
+          </w:pPr>
           <w:r>
             <w:rPr>
               <w:rFonts w:eastAsia="Calibri"/>
@@ -1517,16 +1263,6 @@
               <w:lang w:val="en-US"/>
             </w:rPr>
             <w:t xml:space="preserve">{{spec}}</w:t>
-          </w:r>
-          <w:r>
-            <w:rPr>
-              <w:rFonts w:eastAsia="Calibri"/>
-              <w:b/>
-              <w:bCs/>
-              <w:iCs/>
-              <w:sz w:val="22"/>
-              <w:szCs w:val="22"/>
-            </w:rPr>
           </w:r>
           <w:r>
             <w:rPr>
@@ -1739,8 +1475,332 @@
       <w:suff w:val="tab"/>
     </w:lvl>
   </w:abstractNum>
+  <w:abstractNum w:abstractNumId="1">
+    <w:nsid w:val="57BC163D"/>
+    <w:lvl w:ilvl="0">
+      <w:isLgl w:val="false"/>
+      <w:lvlJc w:val="left"/>
+      <w:lvlText w:val="%1."/>
+      <w:numFmt w:val="decimal"/>
+      <w:pPr>
+        <w:pBdr/>
+        <w:tabs>
+          <w:tab w:val="num" w:leader="none" w:pos="720"/>
+        </w:tabs>
+        <w:spacing/>
+        <w:ind w:hanging="360" w:left="720"/>
+      </w:pPr>
+      <w:rPr>
+        <w:sz w:val="28"/>
+        <w:szCs w:val="28"/>
+      </w:rPr>
+      <w:start w:val="1"/>
+      <w:suff w:val="tab"/>
+    </w:lvl>
+    <w:lvl w:ilvl="1">
+      <w:isLgl w:val="false"/>
+      <w:lvlJc w:val="left"/>
+      <w:lvlText w:val="%2."/>
+      <w:numFmt w:val="decimal"/>
+      <w:pPr>
+        <w:pBdr/>
+        <w:tabs>
+          <w:tab w:val="num" w:leader="none" w:pos="1440"/>
+        </w:tabs>
+        <w:spacing/>
+        <w:ind w:hanging="360" w:left="1440"/>
+      </w:pPr>
+      <w:rPr>
+        <w:sz w:val="28"/>
+        <w:szCs w:val="28"/>
+      </w:rPr>
+      <w:start w:val="1"/>
+      <w:suff w:val="tab"/>
+    </w:lvl>
+    <w:lvl w:ilvl="2">
+      <w:isLgl w:val="false"/>
+      <w:lvlJc w:val="right"/>
+      <w:lvlText w:val="%3."/>
+      <w:numFmt w:val="lowerRoman"/>
+      <w:pPr>
+        <w:pBdr/>
+        <w:tabs>
+          <w:tab w:val="num" w:leader="none" w:pos="2160"/>
+        </w:tabs>
+        <w:spacing/>
+        <w:ind w:hanging="180" w:left="2160"/>
+      </w:pPr>
+      <w:rPr/>
+      <w:start w:val="1"/>
+      <w:suff w:val="tab"/>
+    </w:lvl>
+    <w:lvl w:ilvl="3">
+      <w:isLgl w:val="false"/>
+      <w:lvlJc w:val="left"/>
+      <w:lvlText w:val="%4."/>
+      <w:numFmt w:val="decimal"/>
+      <w:pPr>
+        <w:pBdr/>
+        <w:tabs>
+          <w:tab w:val="num" w:leader="none" w:pos="2880"/>
+        </w:tabs>
+        <w:spacing/>
+        <w:ind w:hanging="360" w:left="2880"/>
+      </w:pPr>
+      <w:rPr/>
+      <w:start w:val="1"/>
+      <w:suff w:val="tab"/>
+    </w:lvl>
+    <w:lvl w:ilvl="4">
+      <w:isLgl w:val="false"/>
+      <w:lvlJc w:val="left"/>
+      <w:lvlText w:val="%5."/>
+      <w:numFmt w:val="lowerLetter"/>
+      <w:pPr>
+        <w:pBdr/>
+        <w:tabs>
+          <w:tab w:val="num" w:leader="none" w:pos="3600"/>
+        </w:tabs>
+        <w:spacing/>
+        <w:ind w:hanging="360" w:left="3600"/>
+      </w:pPr>
+      <w:rPr/>
+      <w:start w:val="1"/>
+      <w:suff w:val="tab"/>
+    </w:lvl>
+    <w:lvl w:ilvl="5">
+      <w:isLgl w:val="false"/>
+      <w:lvlJc w:val="right"/>
+      <w:lvlText w:val="%6."/>
+      <w:numFmt w:val="lowerRoman"/>
+      <w:pPr>
+        <w:pBdr/>
+        <w:tabs>
+          <w:tab w:val="num" w:leader="none" w:pos="4320"/>
+        </w:tabs>
+        <w:spacing/>
+        <w:ind w:hanging="180" w:left="4320"/>
+      </w:pPr>
+      <w:rPr/>
+      <w:start w:val="1"/>
+      <w:suff w:val="tab"/>
+    </w:lvl>
+    <w:lvl w:ilvl="6">
+      <w:isLgl w:val="false"/>
+      <w:lvlJc w:val="left"/>
+      <w:lvlText w:val="%7."/>
+      <w:numFmt w:val="decimal"/>
+      <w:pPr>
+        <w:pBdr/>
+        <w:tabs>
+          <w:tab w:val="num" w:leader="none" w:pos="5040"/>
+        </w:tabs>
+        <w:spacing/>
+        <w:ind w:hanging="360" w:left="5040"/>
+      </w:pPr>
+      <w:rPr/>
+      <w:start w:val="1"/>
+      <w:suff w:val="tab"/>
+    </w:lvl>
+    <w:lvl w:ilvl="7">
+      <w:isLgl w:val="false"/>
+      <w:lvlJc w:val="left"/>
+      <w:lvlText w:val="%8."/>
+      <w:numFmt w:val="lowerLetter"/>
+      <w:pPr>
+        <w:pBdr/>
+        <w:tabs>
+          <w:tab w:val="num" w:leader="none" w:pos="5760"/>
+        </w:tabs>
+        <w:spacing/>
+        <w:ind w:hanging="360" w:left="5760"/>
+      </w:pPr>
+      <w:rPr/>
+      <w:start w:val="1"/>
+      <w:suff w:val="tab"/>
+    </w:lvl>
+    <w:lvl w:ilvl="8">
+      <w:isLgl w:val="false"/>
+      <w:lvlJc w:val="right"/>
+      <w:lvlText w:val="%9."/>
+      <w:numFmt w:val="lowerRoman"/>
+      <w:pPr>
+        <w:pBdr/>
+        <w:tabs>
+          <w:tab w:val="num" w:leader="none" w:pos="6480"/>
+        </w:tabs>
+        <w:spacing/>
+        <w:ind w:hanging="180" w:left="6480"/>
+      </w:pPr>
+      <w:rPr/>
+      <w:start w:val="1"/>
+      <w:suff w:val="tab"/>
+    </w:lvl>
+  </w:abstractNum>
+  <w:abstractNum w:abstractNumId="2">
+    <w:nsid w:val="6D94446C"/>
+    <w:lvl w:ilvl="0">
+      <w:isLgl w:val="false"/>
+      <w:lvlJc w:val="left"/>
+      <w:lvlText w:val="%1."/>
+      <w:numFmt w:val="decimal"/>
+      <w:pPr>
+        <w:pBdr/>
+        <w:spacing/>
+        <w:ind w:hanging="360" w:left="720"/>
+      </w:pPr>
+      <w:rPr/>
+      <w:start w:val="1"/>
+      <w:suff w:val="tab"/>
+    </w:lvl>
+    <w:lvl w:ilvl="1">
+      <w:isLgl w:val="false"/>
+      <w:lvlJc w:val="left"/>
+      <w:lvlText w:val="%2."/>
+      <w:numFmt w:val="lowerLetter"/>
+      <w:pPr>
+        <w:pBdr/>
+        <w:spacing/>
+        <w:ind w:hanging="360" w:left="1440"/>
+      </w:pPr>
+      <w:rPr/>
+      <w:start w:val="1"/>
+      <w:suff w:val="tab"/>
+    </w:lvl>
+    <w:lvl w:ilvl="2">
+      <w:isLgl w:val="false"/>
+      <w:lvlJc w:val="right"/>
+      <w:lvlText w:val="%3."/>
+      <w:numFmt w:val="lowerRoman"/>
+      <w:pPr>
+        <w:pBdr/>
+        <w:spacing/>
+        <w:ind w:hanging="180" w:left="2160"/>
+      </w:pPr>
+      <w:rPr/>
+      <w:start w:val="1"/>
+      <w:suff w:val="tab"/>
+    </w:lvl>
+    <w:lvl w:ilvl="3">
+      <w:isLgl w:val="false"/>
+      <w:lvlJc w:val="left"/>
+      <w:lvlText w:val="%4."/>
+      <w:numFmt w:val="decimal"/>
+      <w:pPr>
+        <w:pBdr/>
+        <w:spacing/>
+        <w:ind w:hanging="360" w:left="2880"/>
+      </w:pPr>
+      <w:rPr/>
+      <w:start w:val="1"/>
+      <w:suff w:val="tab"/>
+    </w:lvl>
+    <w:lvl w:ilvl="4">
+      <w:isLgl w:val="false"/>
+      <w:lvlJc w:val="left"/>
+      <w:lvlText w:val="%5."/>
+      <w:numFmt w:val="lowerLetter"/>
+      <w:pPr>
+        <w:pBdr/>
+        <w:spacing/>
+        <w:ind w:hanging="360" w:left="3600"/>
+      </w:pPr>
+      <w:rPr/>
+      <w:start w:val="1"/>
+      <w:suff w:val="tab"/>
+    </w:lvl>
+    <w:lvl w:ilvl="5">
+      <w:isLgl w:val="false"/>
+      <w:lvlJc w:val="right"/>
+      <w:lvlText w:val="%6."/>
+      <w:numFmt w:val="lowerRoman"/>
+      <w:pPr>
+        <w:pBdr/>
+        <w:spacing/>
+        <w:ind w:hanging="180" w:left="4320"/>
+      </w:pPr>
+      <w:rPr/>
+      <w:start w:val="1"/>
+      <w:suff w:val="tab"/>
+    </w:lvl>
+    <w:lvl w:ilvl="6">
+      <w:isLgl w:val="false"/>
+      <w:lvlJc w:val="left"/>
+      <w:lvlText w:val="%7."/>
+      <w:numFmt w:val="decimal"/>
+      <w:pPr>
+        <w:pBdr/>
+        <w:spacing/>
+        <w:ind w:hanging="360" w:left="5040"/>
+      </w:pPr>
+      <w:rPr/>
+      <w:start w:val="1"/>
+      <w:suff w:val="tab"/>
+    </w:lvl>
+    <w:lvl w:ilvl="7">
+      <w:isLgl w:val="false"/>
+      <w:lvlJc w:val="left"/>
+      <w:lvlText w:val="%8."/>
+      <w:numFmt w:val="lowerLetter"/>
+      <w:pPr>
+        <w:pBdr/>
+        <w:spacing/>
+        <w:ind w:hanging="360" w:left="5760"/>
+      </w:pPr>
+      <w:rPr/>
+      <w:start w:val="1"/>
+      <w:suff w:val="tab"/>
+    </w:lvl>
+    <w:lvl w:ilvl="8">
+      <w:isLgl w:val="false"/>
+      <w:lvlJc w:val="right"/>
+      <w:lvlText w:val="%9."/>
+      <w:numFmt w:val="lowerRoman"/>
+      <w:pPr>
+        <w:pBdr/>
+        <w:spacing/>
+        <w:ind w:hanging="180" w:left="6480"/>
+      </w:pPr>
+      <w:rPr/>
+      <w:start w:val="1"/>
+      <w:suff w:val="tab"/>
+    </w:lvl>
+  </w:abstractNum>
   <w:num w:numId="1">
     <w:abstractNumId w:val="0"/>
+  </w:num>
+  <w:num w:numId="2">
+    <w:abstractNumId w:val="1"/>
+    <w:lvlOverride w:ilvl="0">
+      <w:startOverride w:val="1"/>
+    </w:lvlOverride>
+    <w:lvlOverride w:ilvl="1">
+      <w:startOverride w:val="1"/>
+    </w:lvlOverride>
+    <w:lvlOverride w:ilvl="2">
+      <w:startOverride w:val="1"/>
+    </w:lvlOverride>
+    <w:lvlOverride w:ilvl="3">
+      <w:startOverride w:val="1"/>
+    </w:lvlOverride>
+    <w:lvlOverride w:ilvl="4">
+      <w:startOverride w:val="1"/>
+    </w:lvlOverride>
+    <w:lvlOverride w:ilvl="5">
+      <w:startOverride w:val="1"/>
+    </w:lvlOverride>
+    <w:lvlOverride w:ilvl="6">
+      <w:startOverride w:val="1"/>
+    </w:lvlOverride>
+    <w:lvlOverride w:ilvl="7">
+      <w:startOverride w:val="1"/>
+    </w:lvlOverride>
+    <w:lvlOverride w:ilvl="8">
+      <w:startOverride w:val="1"/>
+    </w:lvlOverride>
+  </w:num>
+  <w:num w:numId="3">
+    <w:abstractNumId w:val="2"/>
   </w:num>
 </w:numbering>
 </file>
@@ -32608,6 +32668,57 @@
       <w:szCs w:val="18"/>
     </w:rPr>
   </w:style>
+  <w:style w:type="paragraph" w:styleId="1_2737" w:customStyle="1">
+    <w:name w:val="Абзац списка"/>
+    <w:basedOn w:val="915"/>
+    <w:next w:val="930"/>
+    <w:link w:val="915"/>
+    <w:uiPriority w:val="34"/>
+    <w:qFormat/>
+    <w:pPr>
+      <w:keepNext w:val="false"/>
+      <w:keepLines w:val="false"/>
+      <w:pageBreakBefore w:val="false"/>
+      <w:widowControl w:val="true"/>
+      <w:suppressLineNumbers w:val="false"/>
+      <w:pBdr>
+        <w:top w:val="none" w:color="000000" w:sz="4" w:space="0"/>
+        <w:left w:val="none" w:color="000000" w:sz="4" w:space="0"/>
+        <w:bottom w:val="none" w:color="000000" w:sz="4" w:space="0"/>
+        <w:right w:val="none" w:color="000000" w:sz="4" w:space="0"/>
+        <w:between w:val="none" w:color="000000" w:sz="4" w:space="0"/>
+      </w:pBdr>
+      <w:shd w:val="nil" w:color="000000"/>
+      <w:bidi w:val="false"/>
+      <w:spacing w:after="0" w:afterAutospacing="0" w:before="0" w:beforeAutospacing="0" w:line="240" w:lineRule="auto"/>
+      <w:ind w:right="0" w:firstLine="0" w:left="708"/>
+      <w:contextualSpacing w:val="false"/>
+      <w:jc w:val="left"/>
+    </w:pPr>
+    <w:rPr>
+      <w:rFonts w:ascii="Times New Roman" w:hAnsi="Times New Roman" w:eastAsia="Times New Roman" w:cs="Times New Roman"/>
+      <w:b w:val="0"/>
+      <w:bCs w:val="0"/>
+      <w:i w:val="0"/>
+      <w:iCs w:val="0"/>
+      <w:caps w:val="0"/>
+      <w:smallCaps w:val="0"/>
+      <w:strike w:val="0"/>
+      <w:vanish w:val="0"/>
+      <w:color w:val="auto"/>
+      <w:spacing w:val="0"/>
+      <w:position w:val="0"/>
+      <w:sz w:val="24"/>
+      <w:szCs w:val="24"/>
+      <w:highlight w:val="none"/>
+      <w:u w:val="none"/>
+      <w:vertAlign w:val="baseline"/>
+      <w:rtl w:val="0"/>
+      <w:cs w:val="0"/>
+      <w:lang w:val="ru-RU" w:eastAsia="ru-RU" w:bidi="ar-SA"/>
+      <w14:ligatures w14:val="none"/>
+    </w:rPr>
+  </w:style>
 </w:styles>
 </file>
 

</xml_diff>